<commit_message>
Add flood-hazard (H1-H6) analysis; discount rate 4.2%; LaTeX equations in report
- Australian flood hazard classification: 18 hazard maps (H1-H6 symbology, works
  in black/white), per-class area/plots/people tables, hazard exposure stats
  (build_hazard_stats.py) -> people in unsafe hazard (H4+) cut ~90% at 200yr
- Discount rate 4.2% -> BCR 0.083, NPV -86.0M (config + workbook + report)
- Report: equations rendered as LaTeX images; new hazard section + hazard-based
  decision weighing; 200yr target / 500yr control depth-damage-hazard maps;
  removed 2yr backwater note
- README updated (hazard inputs/outputs, 4.2%, BCR 0.083)

Note: Hazard 500yr baseline exported without georeferencing (corrupt) - excluded,
pending re-export.

Co-Authored-By: Claude Opus 4.8 <noreply@anthropic.com>
</commit_message>
<xml_diff>
--- a/Data/DOC/Methodology.docx
+++ b/Data/DOC/Methodology.docx
@@ -2492,48 +2492,12 @@
       </w:r>
       <w:proofErr w:type="spellEnd"/>
       <w:r>
-        <w:t xml:space="preserve"> in shapefile are </w:t>
-      </w:r>
-      <w:r>
-        <w:t>Agriculture</w:t>
-      </w:r>
-      <w:r>
-        <w:t xml:space="preserve">, </w:t>
-      </w:r>
-      <w:r>
-        <w:t>Commercial</w:t>
-      </w:r>
-      <w:r>
-        <w:t>, i</w:t>
-      </w:r>
-      <w:r>
-        <w:t>ndustry</w:t>
-      </w:r>
-      <w:r>
-        <w:t xml:space="preserve">, </w:t>
-      </w:r>
-      <w:r>
-        <w:t>Residential</w:t>
-      </w:r>
-      <w:r>
-        <w:t xml:space="preserve">, </w:t>
-      </w:r>
-      <w:r>
-        <w:t>Roads</w:t>
+        <w:t xml:space="preserve"> in shapefile are Agriculture, Commercial, industry, Residential, Roads</w:t>
       </w:r>
     </w:p>
     <w:p>
       <w:r>
-        <w:t>The depth layer for all return periods (2, 5, 10, 25, 50</w:t>
-      </w:r>
-      <w:r>
-        <w:t>,</w:t>
-      </w:r>
-      <w:r>
-        <w:t>100</w:t>
-      </w:r>
-      <w:r>
-        <w:t>,</w:t>
+        <w:t>The depth layer for all return periods (2, 5, 10, 25, 50,100,</w:t>
       </w:r>
       <w:r>
         <w:t xml:space="preserve"> 200,</w:t>
@@ -2583,6 +2547,9 @@
     </w:p>
     <w:p>
       <w:r>
+        <w:rPr>
+          <w:noProof/>
+        </w:rPr>
         <w:lastRenderedPageBreak/>
         <w:drawing>
           <wp:inline distT="0" distB="0" distL="0" distR="0" wp14:anchorId="6EB2E066" wp14:editId="09E58DCE">
@@ -2629,6 +2596,9 @@
     </w:p>
     <w:p>
       <w:r>
+        <w:rPr>
+          <w:noProof/>
+        </w:rPr>
         <w:drawing>
           <wp:inline distT="0" distB="0" distL="0" distR="0" wp14:anchorId="30685CC5" wp14:editId="1A880EA0">
             <wp:extent cx="5943600" cy="4407535"/>
@@ -2707,6 +2677,9 @@
     </w:p>
     <w:p>
       <w:r>
+        <w:rPr>
+          <w:noProof/>
+        </w:rPr>
         <w:drawing>
           <wp:inline distT="0" distB="0" distL="0" distR="0" wp14:anchorId="59E1B17E" wp14:editId="24DB6AAA">
             <wp:extent cx="2981739" cy="1760528"/>
@@ -2752,15 +2725,7 @@
         <w:t xml:space="preserve"> The plots that fall under the project outline + part of those plots that partially fall in the scheme will be considered. </w:t>
       </w:r>
       <w:r>
-        <w:t xml:space="preserve"> </w:t>
-      </w:r>
-      <w:proofErr w:type="spellStart"/>
-      <w:r>
-        <w:t>The</w:t>
-      </w:r>
-      <w:proofErr w:type="spellEnd"/>
-      <w:r>
-        <w:t xml:space="preserve"> unit price of each </w:t>
+        <w:t xml:space="preserve"> The unit price of each </w:t>
       </w:r>
       <w:proofErr w:type="spellStart"/>
       <w:r>
@@ -2787,6 +2752,75 @@
     <w:p>
       <w:r>
         <w:t xml:space="preserve">The project cost is total cost of dam, channels, and relocation. </w:t>
+      </w:r>
+    </w:p>
+    <w:p/>
+    <w:p>
+      <w:r>
+        <w:t>The Australian flood hazard classification is utilized as script in HEC-RAS and the Hazard max is exported for all return periods.</w:t>
+      </w:r>
+    </w:p>
+    <w:p>
+      <w:r>
+        <w:t xml:space="preserve">The </w:t>
+      </w:r>
+      <w:r>
+        <w:t xml:space="preserve">guideline extracted pages are in </w:t>
+      </w:r>
+      <w:r>
+        <w:t>"D:\Mojtaba\Renardet\2224 WS11\</w:t>
+      </w:r>
+      <w:proofErr w:type="spellStart"/>
+      <w:r>
+        <w:t>Majlas</w:t>
+      </w:r>
+      <w:proofErr w:type="spellEnd"/>
+      <w:r>
+        <w:t>\Hydraulic\Flood Protection\Risk\Data\PDF\Australian Flood Hazard pages 10-11.pdf"</w:t>
+      </w:r>
+      <w:r>
+        <w:br/>
+        <w:t>and below image shows the hazard categories from guideline</w:t>
+      </w:r>
+    </w:p>
+    <w:p>
+      <w:r>
+        <w:lastRenderedPageBreak/>
+        <w:drawing>
+          <wp:inline distT="0" distB="0" distL="0" distR="0" wp14:anchorId="5064A105" wp14:editId="55819582">
+            <wp:extent cx="5943600" cy="4470400"/>
+            <wp:effectExtent l="0" t="0" r="0" b="6350"/>
+            <wp:docPr id="4" name="Picture 4"/>
+            <wp:cNvGraphicFramePr>
+              <a:graphicFrameLocks xmlns:a="http://schemas.openxmlformats.org/drawingml/2006/main" noChangeAspect="1"/>
+            </wp:cNvGraphicFramePr>
+            <a:graphic xmlns:a="http://schemas.openxmlformats.org/drawingml/2006/main">
+              <a:graphicData uri="http://schemas.openxmlformats.org/drawingml/2006/picture">
+                <pic:pic xmlns:pic="http://schemas.openxmlformats.org/drawingml/2006/picture">
+                  <pic:nvPicPr>
+                    <pic:cNvPr id="1" name=""/>
+                    <pic:cNvPicPr/>
+                  </pic:nvPicPr>
+                  <pic:blipFill>
+                    <a:blip r:embed="rId8"/>
+                    <a:stretch>
+                      <a:fillRect/>
+                    </a:stretch>
+                  </pic:blipFill>
+                  <pic:spPr>
+                    <a:xfrm>
+                      <a:off x="0" y="0"/>
+                      <a:ext cx="5943600" cy="4470400"/>
+                    </a:xfrm>
+                    <a:prstGeom prst="rect">
+                      <a:avLst/>
+                    </a:prstGeom>
+                  </pic:spPr>
+                </pic:pic>
+              </a:graphicData>
+            </a:graphic>
+          </wp:inline>
+        </w:drawing>
       </w:r>
     </w:p>
     <w:p/>

</xml_diff>